<commit_message>
docs(REP-2908-VERIF): devolucion a Hernan v1.1 - agregar V-06/V-08/V-09/V-11
Actualiza el documento de devolucion con las verificaciones completadas
en esta sesion: V-06 cerrado (similitud FR12 = 1.0), V-08 con correccion
real aplicada (limite de reintentos + limpieza de cron), V-09 corrido con
el hallazgo critico del Caso F (falso positivo reproducible, 5 de 5), y
V-11 con el hallazgo de prompt_version sin poblar.

Co-Authored-By: Claude Sonnet 5 <noreply@anthropic.com>
</commit_message>
<xml_diff>
--- a/docs/REP-2908-VERIF_devolucion-a-hernan.docx
+++ b/docs/REP-2908-VERIF_devolucion-a-hernan.docx
@@ -56,7 +56,7 @@
           <w:sz w:val="20"/>
           <w:szCs w:val="20"/>
         </w:rPr>
-        <w:t xml:space="preserve">Versión 1.0 · 14 de septiembre de 2026 · Construcción · Proyecto RAR-2026</w:t>
+        <w:t xml:space="preserve">Versión 1.1 · 15 de septiembre de 2026 · Construcción · Proyecto RAR-2026</w:t>
       </w:r>
     </w:p>
     <w:p>
@@ -72,7 +72,7 @@
         </w:rPr>
         <w:t xml:space="preserve">Responde a: </w:t>
       </w:r>
-      <w:hyperlink w:history="1" r:id="rIdylq6pdcpgvswhojauuetw">
+      <w:hyperlink w:history="1" r:id="rIdbvr5mw5hsf9e0v3cpnyzh">
         <w:r>
           <w:rPr>
             <w:rStyle w:val="Hyperlink"/>
@@ -96,7 +96,7 @@
         </w:rPr>
         <w:t xml:space="preserve">Jira: </w:t>
       </w:r>
-      <w:hyperlink w:history="1" r:id="rId2bscraswvh3p8-wufbnld">
+      <w:hyperlink w:history="1" r:id="rIdqfgs2nt_q708jyx2zybxy">
         <w:r>
           <w:rPr>
             <w:rStyle w:val="Hyperlink"/>
@@ -113,7 +113,7 @@
         </w:rPr>
         <w:t xml:space="preserve"> · </w:t>
       </w:r>
-      <w:hyperlink w:history="1" r:id="rIdkbkmjly84bmo2m1p2d1py">
+      <w:hyperlink w:history="1" r:id="rId-l9dp6h-6l2xpuzsxskoy">
         <w:r>
           <w:rPr>
             <w:rStyle w:val="Hyperlink"/>
@@ -130,7 +130,7 @@
         </w:rPr>
         <w:t xml:space="preserve"> · </w:t>
       </w:r>
-      <w:hyperlink w:history="1" r:id="rIdrdj7lskoinwdepdgf5zbo">
+      <w:hyperlink w:history="1" r:id="rIdo0yst49i1rzqqsymvdkwe">
         <w:r>
           <w:rPr>
             <w:rStyle w:val="Hyperlink"/>
@@ -147,7 +147,7 @@
         </w:rPr>
         <w:t xml:space="preserve"> · </w:t>
       </w:r>
-      <w:hyperlink w:history="1" r:id="rIdj9b6xivr1lqnodnuiezzs">
+      <w:hyperlink w:history="1" r:id="rIdvyxpwhpzwjkx3wx-kygv0">
         <w:r>
           <w:rPr>
             <w:rStyle w:val="Hyperlink"/>
@@ -164,7 +164,7 @@
         </w:rPr>
         <w:t xml:space="preserve"> · </w:t>
       </w:r>
-      <w:hyperlink w:history="1" r:id="rId5czpaecpmpmd0zcetqtbd">
+      <w:hyperlink w:history="1" r:id="rIdxkysdsfyuuq5kz6coecc5">
         <w:r>
           <w:rPr>
             <w:rStyle w:val="Hyperlink"/>
@@ -181,7 +181,7 @@
         </w:rPr>
         <w:t xml:space="preserve"> · </w:t>
       </w:r>
-      <w:hyperlink w:history="1" r:id="rId0dlns0adjz8o0sne8j3yn">
+      <w:hyperlink w:history="1" r:id="rIdtioju5egk4wrqztxk4b1q">
         <w:r>
           <w:rPr>
             <w:rStyle w:val="Hyperlink"/>
@@ -198,7 +198,7 @@
         </w:rPr>
         <w:t xml:space="preserve"> · </w:t>
       </w:r>
-      <w:hyperlink w:history="1" r:id="rIdpnnjgpyoo0-1l_83ww3rp">
+      <w:hyperlink w:history="1" r:id="rIdc_jyv9cjall7yp_te0uvt">
         <w:r>
           <w:rPr>
             <w:rStyle w:val="Hyperlink"/>
@@ -206,6 +206,23 @@
             <w:u w:val="single"/>
           </w:rPr>
           <w:t xml:space="preserve">REP-2909</w:t>
+        </w:r>
+      </w:hyperlink>
+      <w:r>
+        <w:rPr>
+          <w:sz w:val="20"/>
+          <w:szCs w:val="20"/>
+        </w:rPr>
+        <w:t xml:space="preserve"> · </w:t>
+      </w:r>
+      <w:hyperlink w:history="1" r:id="rId32xewl3yaubjqaszswvv9">
+        <w:r>
+          <w:rPr>
+            <w:rStyle w:val="Hyperlink"/>
+            <w:color w:val="1155CC"/>
+            <w:u w:val="single"/>
+          </w:rPr>
+          <w:t xml:space="preserve">REP-2910</w:t>
         </w:r>
       </w:hyperlink>
     </w:p>
@@ -661,7 +678,7 @@
                 <w:sz w:val="18"/>
                 <w:szCs w:val="18"/>
               </w:rPr>
-              <w:t xml:space="preserve">Parcial</w:t>
+              <w:t xml:space="preserve">Cerrado en lo crítico</w:t>
             </w:r>
           </w:p>
         </w:tc>
@@ -931,7 +948,7 @@
                 <w:sz w:val="18"/>
                 <w:szCs w:val="18"/>
               </w:rPr>
-              <w:t xml:space="preserve">No iniciado</w:t>
+              <w:t xml:space="preserve">Cerrado</w:t>
             </w:r>
           </w:p>
         </w:tc>
@@ -1111,7 +1128,7 @@
                 <w:sz w:val="18"/>
                 <w:szCs w:val="18"/>
               </w:rPr>
-              <w:t xml:space="preserve">No iniciado</w:t>
+              <w:t xml:space="preserve">Parcial</w:t>
             </w:r>
           </w:p>
         </w:tc>
@@ -1120,6 +1137,7 @@
         <w:tc>
           <w:tcPr>
             <w:tcW w:type="dxa" w:w="700"/>
+            <w:shd w:fill="FDECEA" w:val="clear"/>
             <w:tcMar>
               <w:top w:type="dxa" w:w="70"/>
               <w:left w:type="dxa" w:w="90"/>
@@ -1142,6 +1160,7 @@
         <w:tc>
           <w:tcPr>
             <w:tcW w:type="dxa" w:w="3000"/>
+            <w:shd w:fill="FDECEA" w:val="clear"/>
             <w:tcMar>
               <w:top w:type="dxa" w:w="70"/>
               <w:left w:type="dxa" w:w="90"/>
@@ -1164,6 +1183,7 @@
         <w:tc>
           <w:tcPr>
             <w:tcW w:type="dxa" w:w="1400"/>
+            <w:shd w:fill="FDECEA" w:val="clear"/>
             <w:tcMar>
               <w:top w:type="dxa" w:w="70"/>
               <w:left w:type="dxa" w:w="90"/>
@@ -1186,22 +1206,23 @@
         <w:tc>
           <w:tcPr>
             <w:tcW w:type="dxa" w:w="4250"/>
-            <w:tcMar>
-              <w:top w:type="dxa" w:w="70"/>
-              <w:left w:type="dxa" w:w="90"/>
-              <w:bottom w:type="dxa" w:w="70"/>
-              <w:right w:type="dxa" w:w="90"/>
-            </w:tcMar>
-          </w:tcPr>
-          <w:p>
-            <w:r>
-              <w:rPr>
-                <w:b w:val="false"/>
-                <w:bCs w:val="false"/>
-                <w:sz w:val="18"/>
-                <w:szCs w:val="18"/>
-              </w:rPr>
-              <w:t xml:space="preserve">No iniciado</w:t>
+            <w:shd w:fill="FDECEA" w:val="clear"/>
+            <w:tcMar>
+              <w:top w:type="dxa" w:w="70"/>
+              <w:left w:type="dxa" w:w="90"/>
+              <w:bottom w:type="dxa" w:w="70"/>
+              <w:right w:type="dxa" w:w="90"/>
+            </w:tcMar>
+          </w:tcPr>
+          <w:p>
+            <w:r>
+              <w:rPr>
+                <w:b w:val="false"/>
+                <w:bCs w:val="false"/>
+                <w:sz w:val="18"/>
+                <w:szCs w:val="18"/>
+              </w:rPr>
+              <w:t xml:space="preserve">Corrido — falla en el Caso F</w:t>
             </w:r>
           </w:p>
         </w:tc>
@@ -1381,7 +1402,7 @@
                 <w:sz w:val="18"/>
                 <w:szCs w:val="18"/>
               </w:rPr>
-              <w:t xml:space="preserve">No iniciado</w:t>
+              <w:t xml:space="preserve">Parcial</w:t>
             </w:r>
           </w:p>
         </w:tc>
@@ -1571,6 +1592,32 @@
       <w:pPr>
         <w:spacing w:after="200"/>
       </w:pPr>
+    </w:p>
+    <w:p>
+      <w:pPr>
+        <w:pBdr>
+          <w:left w:val="single" w:color="B00020" w:sz="28" w:space="10"/>
+        </w:pBdr>
+        <w:shd w:fill="FDECEA" w:val="clear"/>
+        <w:spacing w:after="200"/>
+      </w:pPr>
+      <w:r>
+        <w:rPr>
+          <w:b/>
+          <w:bCs/>
+          <w:color w:val="B00020"/>
+          <w:sz w:val="21"/>
+          <w:szCs w:val="21"/>
+        </w:rPr>
+        <w:t xml:space="preserve">El hallazgo más importante de esta actualización es V-09. </w:t>
+      </w:r>
+      <w:r>
+        <w:rPr>
+          <w:sz w:val="21"/>
+          <w:szCs w:val="21"/>
+        </w:rPr>
+        <w:t xml:space="preserve">El Caso F — el que el propio documento de Hernán marca como el más importante del set — falló 5 de 5 corridas. Ver sección 2.</w:t>
+      </w:r>
     </w:p>
     <w:p>
       <w:pPr>
@@ -1604,7 +1651,7 @@
           <w:sz w:val="21"/>
           <w:szCs w:val="21"/>
         </w:rPr>
-        <w:t xml:space="preserve">Confirmado el hallazgo, con un matiz: la clave no vivía en el código de una función (pg_proc, que es donde busca la Consulta 1 del documento original), sino en la definición del trigger audit_ia (pg_trigger, embebida en la llamada a supabase_functions.http_request). La Consulta 1 tal como está escrita no la detecta — se recomienda ampliarla para incluir pg_get_triggerdef.</w:t>
+        <w:t xml:space="preserve">Confirmado el hallazgo, con un matiz: la clave no vivía en el código de una función (pg_proc), sino en la definición del trigger audit_ia (pg_trigger, embebida en supabase_functions.http_request). La Consulta 1 original no la detecta — se recomienda ampliarla con pg_get_triggerdef.</w:t>
       </w:r>
     </w:p>
     <w:p>
@@ -1621,7 +1668,7 @@
           <w:sz w:val="21"/>
           <w:szCs w:val="21"/>
         </w:rPr>
-        <w:t xml:space="preserve">Trigger audit_ia desactivado sin borrar (tabla infractions, 0 filas — heredada, sin uso).</w:t>
+        <w:t xml:space="preserve">Trigger audit_ia desactivado sin borrar (tabla infractions, 0 filas).</w:t>
       </w:r>
     </w:p>
     <w:p>
@@ -1638,7 +1685,7 @@
           <w:sz w:val="21"/>
           <w:szCs w:val="21"/>
         </w:rPr>
-        <w:t xml:space="preserve">Clave service_role rotada desde el panel de Supabase: migrada al esquema moderno de secret keys (sb_secret_...), claves legacy basadas en JWT deshabilitadas.</w:t>
+        <w:t xml:space="preserve">Clave service_role rotada: migrada al esquema moderno de secret keys, claves legacy JWT deshabilitadas.</w:t>
       </w:r>
     </w:p>
     <w:p>
@@ -1655,7 +1702,7 @@
           <w:sz w:val="21"/>
           <w:szCs w:val="21"/>
         </w:rPr>
-        <w:t xml:space="preserve">Secreto de Vault rag_service_role_key actualizado con la clave nueva.</w:t>
+        <w:t xml:space="preserve">Secreto de Vault rag_service_role_key actualizado.</w:t>
       </w:r>
     </w:p>
     <w:p>
@@ -1672,24 +1719,7 @@
           <w:sz w:val="21"/>
           <w:szCs w:val="21"/>
         </w:rPr>
-        <w:t xml:space="preserve">Verificado que el sitio en producción sigue funcionando con la clave anon/publishable actual.</w:t>
-      </w:r>
-    </w:p>
-    <w:p>
-      <w:pPr>
-        <w:pStyle w:val="ListParagraph"/>
-        <w:numPr>
-          <w:ilvl w:val="0"/>
-          <w:numId w:val="2"/>
-        </w:numPr>
-        <w:spacing w:after="70"/>
-      </w:pPr>
-      <w:r>
-        <w:rPr>
-          <w:sz w:val="21"/>
-          <w:szCs w:val="21"/>
-        </w:rPr>
-        <w:t xml:space="preserve">Verificado con V-07 que el pipeline funciona de punta a punta con la clave nueva.</w:t>
+        <w:t xml:space="preserve">Sitio en producción y pipeline (V-07) verificados funcionando con la clave nueva.</w:t>
       </w:r>
     </w:p>
     <w:p>
@@ -1715,58 +1745,7 @@
           <w:sz w:val="21"/>
           <w:szCs w:val="21"/>
         </w:rPr>
-        <w:t xml:space="preserve">Confirmado: supabase/backups/2026-09-14_pre-deploy-rag/ (commit f17e512) ya está pusheado y mergeado en staging — no llegamos a tiempo de avisar antes del push.</w:t>
-      </w:r>
-    </w:p>
-    <w:p>
-      <w:pPr>
-        <w:pStyle w:val="ListParagraph"/>
-        <w:numPr>
-          <w:ilvl w:val="0"/>
-          <w:numId w:val="2"/>
-        </w:numPr>
-        <w:spacing w:after="70"/>
-      </w:pPr>
-      <w:r>
-        <w:rPr>
-          <w:sz w:val="21"/>
-          <w:szCs w:val="21"/>
-        </w:rPr>
-        <w:t xml:space="preserve">Revisado el contenido del backup commiteado: no contiene el JWT filtrado de audit_ia, pero sí datos reales de 44 tablas.</w:t>
-      </w:r>
-    </w:p>
-    <w:p>
-      <w:pPr>
-        <w:pStyle w:val="ListParagraph"/>
-        <w:numPr>
-          <w:ilvl w:val="0"/>
-          <w:numId w:val="2"/>
-        </w:numPr>
-        <w:spacing w:after="70"/>
-      </w:pPr>
-      <w:r>
-        <w:rPr>
-          <w:sz w:val="21"/>
-          <w:szCs w:val="21"/>
-        </w:rPr>
-        <w:t xml:space="preserve">Se agregó supabase/backups/ al .gitignore para que no vuelva a pasar.</w:t>
-      </w:r>
-    </w:p>
-    <w:p>
-      <w:pPr>
-        <w:pStyle w:val="ListParagraph"/>
-        <w:numPr>
-          <w:ilvl w:val="0"/>
-          <w:numId w:val="2"/>
-        </w:numPr>
-        <w:spacing w:after="70"/>
-      </w:pPr>
-      <w:r>
-        <w:rPr>
-          <w:sz w:val="21"/>
-          <w:szCs w:val="21"/>
-        </w:rPr>
-        <w:t xml:space="preserve">Pendiente de decisión conjunta: limpiar el historial de staging (requiere coordinar con quien tenga la rama clonada) o aceptar el riesgo dado que la clave especifica no viajó por ese archivo.</w:t>
+        <w:t xml:space="preserve">Confirmado: supabase/backups/2026-09-14_pre-deploy-rag/ ya está pusheado y mergeado en staging. No contiene el JWT filtrado, pero sí datos reales de 44 tablas. Se agregó supabase/backups/ al .gitignore. Pendiente de decisión conjunta sobre limpiar el historial de staging.</w:t>
       </w:r>
     </w:p>
     <w:p>
@@ -1780,7 +1759,7 @@
           <w:sz w:val="23"/>
           <w:szCs w:val="23"/>
         </w:rPr>
-        <w:t xml:space="preserve">V-03 · Hallazgos de seguridad que ya existían — Parcial</w:t>
+        <w:t xml:space="preserve">V-03 · Hallazgos de seguridad que ya existían — Cerrado en lo crítico</w:t>
       </w:r>
     </w:p>
     <w:p>
@@ -1792,7 +1771,7 @@
           <w:sz w:val="21"/>
           <w:szCs w:val="21"/>
         </w:rPr>
-        <w:t xml:space="preserve">Corrido el Security Advisor completo y las tres consultas pedidas: 0 tablas sin RLS. 17 tablas con RLS habilitado sin ninguna política (deny total, no hueco) — mayoría de solo lectura server-side; falta que Hernán confirme cuáles son intencionales. Políticas de report_ai_analysis/report_ai_evidence correctas (criterio REP-2909 ya aplicado).</w:t>
+        <w:t xml:space="preserve">0 tablas sin RLS. 17 tablas con RLS sin políticas (deny total, no hueco). Políticas de report_ai_analysis/evidence correctas.</w:t>
       </w:r>
     </w:p>
     <w:p>
@@ -1809,14 +1788,14 @@
           <w:sz w:val="21"/>
           <w:szCs w:val="21"/>
         </w:rPr>
-        <w:t xml:space="preserve">Hallazgo nuevo, no listado en el documento original. </w:t>
-      </w:r>
-      <w:r>
-        <w:rPr>
-          <w:sz w:val="21"/>
-          <w:szCs w:val="21"/>
-        </w:rPr>
-        <w:t xml:space="preserve">dispatch_rag_analysis_queue y enqueue_rag_analysis (SECURITY DEFINER) eran ejecutables vía /rest/v1/rpc/... por los roles anon y authenticated — cualquiera podía disparar el pipeline de análisis y generar costo real de Gemini sin pasar por un reporte real. Corregido: revocado EXECUTE de PUBLIC y de authenticated. Verificado que el disparo interno (trigger + cron) sigue funcionando.</w:t>
+        <w:t xml:space="preserve">Hallazgo nuevo. </w:t>
+      </w:r>
+      <w:r>
+        <w:rPr>
+          <w:sz w:val="21"/>
+          <w:szCs w:val="21"/>
+        </w:rPr>
+        <w:t xml:space="preserve">dispatch_rag_analysis_queue y enqueue_rag_analysis eran ejecutables vía RPC público por anon y authenticated. Corregido: revocado EXECUTE de PUBLIC y authenticated. Disparo interno verificado sin cambios.</w:t>
       </w:r>
     </w:p>
     <w:p>
@@ -1828,7 +1807,7 @@
           <w:sz w:val="21"/>
           <w:szCs w:val="21"/>
         </w:rPr>
-        <w:t xml:space="preserve">Pendientes menores (WARN, no bloqueantes): 10 funciones sin search_path fijo, extensión vector instalada en public, protección de contraseñas filtradas desactivada en Auth.</w:t>
+        <w:t xml:space="preserve">Pendientes menores (WARN): 10 funciones sin search_path fijo, extensión vector en public, protección de contraseñas filtradas desactivada.</w:t>
       </w:r>
     </w:p>
     <w:p>
@@ -1854,70 +1833,7 @@
           <w:sz w:val="21"/>
           <w:szCs w:val="21"/>
         </w:rPr>
-        <w:t xml:space="preserve">Corrida la PARTE 8 completa de REP-3769_seed_y_RAG.sql: todo OK salvo tres filas en REVISAR — profiles (5 de 6), citizen_reports (0 de 8) y report_state_history (0 de 18). Los 5 perfiles existentes son cuentas reales del equipo, no el seed demo: confirma que ciudadano.demo y los 8 reportes demo nunca se recargaron tras el incidente de borrado de sesiones anteriores.</w:t>
-      </w:r>
-    </w:p>
-    <w:p>
-      <w:pPr>
-        <w:pStyle w:val="ListParagraph"/>
-        <w:numPr>
-          <w:ilvl w:val="0"/>
-          <w:numId w:val="2"/>
-        </w:numPr>
-        <w:spacing w:after="70"/>
-      </w:pPr>
-      <w:r>
-        <w:rPr>
-          <w:sz w:val="21"/>
-          <w:szCs w:val="21"/>
-        </w:rPr>
-        <w:t xml:space="preserve">PARTE 5B/6 presentes (report_events, profile_attends_report, mark_report_viewed, source_adhesions, generation_models, etc.).</w:t>
-      </w:r>
-    </w:p>
-    <w:p>
-      <w:pPr>
-        <w:pStyle w:val="ListParagraph"/>
-        <w:numPr>
-          <w:ilvl w:val="0"/>
-          <w:numId w:val="2"/>
-        </w:numPr>
-        <w:spacing w:after="70"/>
-      </w:pPr>
-      <w:r>
-        <w:rPr>
-          <w:sz w:val="21"/>
-          <w:szCs w:val="21"/>
-        </w:rPr>
-        <w:t xml:space="preserve">Las 15 huellas md5 del corpus coinciden exactamente con las esperadas.</w:t>
-      </w:r>
-    </w:p>
-    <w:p>
-      <w:pPr>
-        <w:pStyle w:val="ListParagraph"/>
-        <w:numPr>
-          <w:ilvl w:val="0"/>
-          <w:numId w:val="2"/>
-        </w:numPr>
-        <w:spacing w:after="70"/>
-      </w:pPr>
-      <w:r>
-        <w:rPr>
-          <w:sz w:val="21"/>
-          <w:szCs w:val="21"/>
-        </w:rPr>
-        <w:t xml:space="preserve">Cascada jurisdiccional correcta: Piñeyro (BA) recibe la Ley 24.449, Retiro (CABA) no la recibe, Avellaneda (Santa Fe) no recibe nada.</w:t>
-      </w:r>
-    </w:p>
-    <w:p>
-      <w:pPr>
-        <w:spacing w:after="150"/>
-      </w:pPr>
-      <w:r>
-        <w:rPr>
-          <w:sz w:val="21"/>
-          <w:szCs w:val="21"/>
-        </w:rPr>
-        <w:t xml:space="preserve">Pendiente de decisión: si se recargan los seeds demo (dispara 8 análisis reales de Gemini, costo bajo, sirve además como evidencia adicional de V-07).</w:t>
+        <w:t xml:space="preserve">PARTE 8 completa: todo OK salvo profiles (5 de 6), citizen_reports (0 de 8) y report_state_history (0 de 18) — los seeds demo nunca se recargaron. Las 15 huellas del corpus coinciden exactamente. Cascada jurisdiccional correcta. Pendiente decidir si se recargan los seeds demo.</w:t>
       </w:r>
     </w:p>
     <w:p>
@@ -1943,7 +1859,7 @@
           <w:sz w:val="21"/>
           <w:szCs w:val="21"/>
         </w:rPr>
-        <w:t xml:space="preserve">Se leyó el historial interno real de Supabase (supabase_migrations.schema_migrations) y se versionaron como archivos en supabase/migrations/ el SQL exacto y los timestamps reales de cada cambio aplicado a mano durante el despliegue original: extensiones, RLS de report_ai_analysis/evidence, secreto de Vault con la URL de la Edge Function, pipeline asíncrono completo, corrección del cron, RLS de report_images, y las correcciones de V-01/V-03.</w:t>
+        <w:t xml:space="preserve">Se versionaron 11 migraciones con el SQL exacto y los timestamps reales leídos del historial interno de Supabase: extensiones, RLS, secreto de Vault, pipeline asíncrono, cron, RLS de report_images, y las correcciones de V-01/V-03/V-08.</w:t>
       </w:r>
     </w:p>
     <w:p>
@@ -1960,14 +1876,14 @@
           <w:sz w:val="21"/>
           <w:szCs w:val="21"/>
         </w:rPr>
-        <w:t xml:space="preserve">Hallazgo nuevo, no documentado en ningún lado hasta ahora. </w:t>
-      </w:r>
-      <w:r>
-        <w:rPr>
-          <w:sz w:val="21"/>
-          <w:szCs w:val="21"/>
-        </w:rPr>
-        <w:t xml:space="preserve">el esquema pgmq no está expuesto en la API de datos de Supabase, así que el borrado de mensajes procesados desde la Edge Function fallaba silenciosamente y los reprocesaba cada minuto para siempre. Ya estaba resuelto con un wrapper, pero nunca se había versionado ni documentado.</w:t>
+        <w:t xml:space="preserve">Hallazgo nuevo. </w:t>
+      </w:r>
+      <w:r>
+        <w:rPr>
+          <w:sz w:val="21"/>
+          <w:szCs w:val="21"/>
+        </w:rPr>
+        <w:t xml:space="preserve">el esquema pgmq no está expuesto en la API de Supabase — el borrado de mensajes procesados fallaba silenciosamente y los reprocesaba para siempre. Ya resuelto con un wrapper, nunca documentado hasta ahora.</w:t>
       </w:r>
     </w:p>
     <w:p>
@@ -1979,19 +1895,7 @@
           <w:sz w:val="21"/>
           <w:szCs w:val="21"/>
         </w:rPr>
-        <w:t xml:space="preserve">Excluido a propósito, según el documento original: los 3 backfills de embeddings (se documenta el comando para regenerarlos) y el valor de la clave rag_service_role_key.</w:t>
-      </w:r>
-    </w:p>
-    <w:p>
-      <w:pPr>
-        <w:spacing w:after="150"/>
-      </w:pPr>
-      <w:r>
-        <w:rPr>
-          <w:sz w:val="21"/>
-          <w:szCs w:val="21"/>
-        </w:rPr>
-        <w:t xml:space="preserve">Pendiente: abrir el Pull Request. El documento original dice contra develop, rama que no existe en este repositorio — la base real de todo el trabajo de Sprint 12 fue siempre staging.</w:t>
+        <w:t xml:space="preserve">Excluidos a propósito: los 3 backfills de embeddings y el valor de la clave rag_service_role_key. Pendiente: abrir el PR contra staging (develop no existe en este repositorio).</w:t>
       </w:r>
     </w:p>
     <w:p>
@@ -2005,7 +1909,19 @@
           <w:sz w:val="23"/>
           <w:szCs w:val="23"/>
         </w:rPr>
-        <w:t xml:space="preserve">V-06 · Mismo embedding en script y Edge Function — No iniciado</w:t>
+        <w:t xml:space="preserve">V-06 · Mismo embedding en script y Edge Function — Cerrado</w:t>
+      </w:r>
+    </w:p>
+    <w:p>
+      <w:pPr>
+        <w:spacing w:after="150"/>
+      </w:pPr>
+      <w:r>
+        <w:rPr>
+          <w:sz w:val="21"/>
+          <w:szCs w:val="21"/>
+        </w:rPr>
+        <w:t xml:space="preserve">Parámetros idénticos entre el script local y la Edge Function real. Se generó el embedding de FR12 con el código exacto de la Edge Function y se comparó contra el guardado: similitud = 1.0.</w:t>
       </w:r>
     </w:p>
     <w:p>
@@ -2020,18 +1936,6 @@
           <w:szCs w:val="23"/>
         </w:rPr>
         <w:t xml:space="preserve">V-07 · Prueba de punta a punta — Cerrado</w:t>
-      </w:r>
-    </w:p>
-    <w:p>
-      <w:pPr>
-        <w:spacing w:after="150"/>
-      </w:pPr>
-      <w:r>
-        <w:rPr>
-          <w:sz w:val="21"/>
-          <w:szCs w:val="21"/>
-        </w:rPr>
-        <w:t xml:space="preserve">El script exacto del documento no pudo correr tal cual (no existe el perfil ciudadano.demo) — se adaptó usando un perfil real del equipo, con OK explícito de Matías antes del insert.</w:t>
       </w:r>
     </w:p>
     <w:tbl>
@@ -2117,7 +2021,7 @@
                 <w:sz w:val="18"/>
                 <w:szCs w:val="18"/>
               </w:rPr>
-              <w:t xml:space="preserve">Insert del reporte de prueba</w:t>
+              <w:t xml:space="preserve">Insert → report_ai_analysis creado</w:t>
             </w:r>
           </w:p>
         </w:tc>
@@ -2139,7 +2043,7 @@
                 <w:sz w:val="18"/>
                 <w:szCs w:val="18"/>
               </w:rPr>
-              <w:t xml:space="preserve">23:51:48</w:t>
+              <w:t xml:space="preserve">~15 segundos</w:t>
             </w:r>
           </w:p>
         </w:tc>
@@ -2163,7 +2067,7 @@
                 <w:sz w:val="18"/>
                 <w:szCs w:val="18"/>
               </w:rPr>
-              <w:t xml:space="preserve">report_ai_analysis creado</w:t>
+              <w:t xml:space="preserve">Resultado</w:t>
             </w:r>
           </w:p>
         </w:tc>
@@ -2185,7 +2089,7 @@
                 <w:sz w:val="18"/>
                 <w:szCs w:val="18"/>
               </w:rPr>
-              <w:t xml:space="preserve">23:52:03 (~15 segundos)</w:t>
+              <w:t xml:space="preserve">fundamentado, confidence_score: 0.98</w:t>
             </w:r>
           </w:p>
         </w:tc>
@@ -2209,7 +2113,7 @@
                 <w:sz w:val="18"/>
                 <w:szCs w:val="18"/>
               </w:rPr>
-              <w:t xml:space="preserve">Cola pgmq</w:t>
+              <w:t xml:space="preserve">Evidencia</w:t>
             </w:r>
           </w:p>
         </w:tc>
@@ -2231,145 +2135,7 @@
                 <w:sz w:val="18"/>
                 <w:szCs w:val="18"/>
               </w:rPr>
-              <w:t xml:space="preserve">Vacía — procesado y removido</w:t>
-            </w:r>
-          </w:p>
-        </w:tc>
-      </w:tr>
-      <w:tr>
-        <w:tc>
-          <w:tcPr>
-            <w:tcW w:type="dxa" w:w="3200"/>
-            <w:tcMar>
-              <w:top w:type="dxa" w:w="70"/>
-              <w:left w:type="dxa" w:w="90"/>
-              <w:bottom w:type="dxa" w:w="70"/>
-              <w:right w:type="dxa" w:w="90"/>
-            </w:tcMar>
-          </w:tcPr>
-          <w:p>
-            <w:r>
-              <w:rPr>
-                <w:b w:val="false"/>
-                <w:bCs w:val="false"/>
-                <w:sz w:val="18"/>
-                <w:szCs w:val="18"/>
-              </w:rPr>
-              <w:t xml:space="preserve">Resultado</w:t>
-            </w:r>
-          </w:p>
-        </w:tc>
-        <w:tc>
-          <w:tcPr>
-            <w:tcW w:type="dxa" w:w="6150"/>
-            <w:tcMar>
-              <w:top w:type="dxa" w:w="70"/>
-              <w:left w:type="dxa" w:w="90"/>
-              <w:bottom w:type="dxa" w:w="70"/>
-              <w:right w:type="dxa" w:w="90"/>
-            </w:tcMar>
-          </w:tcPr>
-          <w:p>
-            <w:r>
-              <w:rPr>
-                <w:b w:val="false"/>
-                <w:bCs w:val="false"/>
-                <w:sz w:val="18"/>
-                <w:szCs w:val="18"/>
-              </w:rPr>
-              <w:t xml:space="preserve">fundamentado, is_infraction: true, confidence_score: 0.98</w:t>
-            </w:r>
-          </w:p>
-        </w:tc>
-      </w:tr>
-      <w:tr>
-        <w:tc>
-          <w:tcPr>
-            <w:tcW w:type="dxa" w:w="3200"/>
-            <w:tcMar>
-              <w:top w:type="dxa" w:w="70"/>
-              <w:left w:type="dxa" w:w="90"/>
-              <w:bottom w:type="dxa" w:w="70"/>
-              <w:right w:type="dxa" w:w="90"/>
-            </w:tcMar>
-          </w:tcPr>
-          <w:p>
-            <w:r>
-              <w:rPr>
-                <w:b w:val="false"/>
-                <w:bCs w:val="false"/>
-                <w:sz w:val="18"/>
-                <w:szCs w:val="18"/>
-              </w:rPr>
-              <w:t xml:space="preserve">report_ai_evidence</w:t>
-            </w:r>
-          </w:p>
-        </w:tc>
-        <w:tc>
-          <w:tcPr>
-            <w:tcW w:type="dxa" w:w="6150"/>
-            <w:tcMar>
-              <w:top w:type="dxa" w:w="70"/>
-              <w:left w:type="dxa" w:w="90"/>
-              <w:bottom w:type="dxa" w:w="70"/>
-              <w:right w:type="dxa" w:w="90"/>
-            </w:tcMar>
-          </w:tcPr>
-          <w:p>
-            <w:r>
-              <w:rPr>
-                <w:b w:val="false"/>
-                <w:bCs w:val="false"/>
-                <w:sz w:val="18"/>
-                <w:szCs w:val="18"/>
-              </w:rPr>
-              <w:t xml:space="preserve">6 fragmentos recuperados, todos de CABA (cero de la Ley 24.449)</w:t>
-            </w:r>
-          </w:p>
-        </w:tc>
-      </w:tr>
-      <w:tr>
-        <w:tc>
-          <w:tcPr>
-            <w:tcW w:type="dxa" w:w="3200"/>
-            <w:tcMar>
-              <w:top w:type="dxa" w:w="70"/>
-              <w:left w:type="dxa" w:w="90"/>
-              <w:bottom w:type="dxa" w:w="70"/>
-              <w:right w:type="dxa" w:w="90"/>
-            </w:tcMar>
-          </w:tcPr>
-          <w:p>
-            <w:r>
-              <w:rPr>
-                <w:b w:val="false"/>
-                <w:bCs w:val="false"/>
-                <w:sz w:val="18"/>
-                <w:szCs w:val="18"/>
-              </w:rPr>
-              <w:t xml:space="preserve">Citas</w:t>
-            </w:r>
-          </w:p>
-        </w:tc>
-        <w:tc>
-          <w:tcPr>
-            <w:tcW w:type="dxa" w:w="6150"/>
-            <w:tcMar>
-              <w:top w:type="dxa" w:w="70"/>
-              <w:left w:type="dxa" w:w="90"/>
-              <w:bottom w:type="dxa" w:w="70"/>
-              <w:right w:type="dxa" w:w="90"/>
-            </w:tcMar>
-          </w:tcPr>
-          <w:p>
-            <w:r>
-              <w:rPr>
-                <w:b w:val="false"/>
-                <w:bCs w:val="false"/>
-                <w:sz w:val="18"/>
-                <w:szCs w:val="18"/>
-              </w:rPr>
-              <w:t xml:space="preserve">2 citadas, ambas literales sobre rampas para discapacitados — coincide con el reporte</w:t>
+              <w:t xml:space="preserve">6 fragmentos recuperados, todos de CABA; 2 citas literales correctas</w:t>
             </w:r>
           </w:p>
         </w:tc>
@@ -2389,7 +2155,7 @@
           <w:sz w:val="21"/>
           <w:szCs w:val="21"/>
         </w:rPr>
-        <w:t xml:space="preserve">Corrido íntegramente con la clave service_role nueva (post-rotación de V-01). El reporte de prueba queda en la base como evidencia, no se borró.</w:t>
+        <w:t xml:space="preserve">Corrido íntegramente con la clave service_role nueva (post-rotación de V-01).</w:t>
       </w:r>
     </w:p>
     <w:p>
@@ -2403,7 +2169,82 @@
           <w:sz w:val="23"/>
           <w:szCs w:val="23"/>
         </w:rPr>
-        <w:t xml:space="preserve">V-08 · Límite de reintentos y alerta de presupuesto — No iniciado</w:t>
+        <w:t xml:space="preserve">V-08 · Límite de reintentos y alerta de presupuesto — Parcial</w:t>
+      </w:r>
+    </w:p>
+    <w:p>
+      <w:pPr>
+        <w:spacing w:after="150"/>
+      </w:pPr>
+      <w:r>
+        <w:rPr>
+          <w:sz w:val="21"/>
+          <w:szCs w:val="21"/>
+        </w:rPr>
+        <w:t xml:space="preserve">Confirmado: dispatch_rag_analysis_queue no revisaba read_ct — reintentos infinitos con costo real. cron.job_run_details: 350 filas en ~7.5 horas.</w:t>
+      </w:r>
+    </w:p>
+    <w:p>
+      <w:pPr>
+        <w:pStyle w:val="ListParagraph"/>
+        <w:numPr>
+          <w:ilvl w:val="0"/>
+          <w:numId w:val="2"/>
+        </w:numPr>
+        <w:spacing w:after="70"/>
+      </w:pPr>
+      <w:r>
+        <w:rPr>
+          <w:sz w:val="21"/>
+          <w:szCs w:val="21"/>
+        </w:rPr>
+        <w:t xml:space="preserve">Aplicado: límite de 5 reintentos, archivado del mensaje (sin borrar) y análisis "indeterminado" con motivo al superarlo.</w:t>
+      </w:r>
+    </w:p>
+    <w:p>
+      <w:pPr>
+        <w:pStyle w:val="ListParagraph"/>
+        <w:numPr>
+          <w:ilvl w:val="0"/>
+          <w:numId w:val="2"/>
+        </w:numPr>
+        <w:spacing w:after="70"/>
+      </w:pPr>
+      <w:r>
+        <w:rPr>
+          <w:sz w:val="21"/>
+          <w:szCs w:val="21"/>
+        </w:rPr>
+        <w:t xml:space="preserve">Nueva tarea diaria que limpia cron.job_run_details (&gt;7 días).</w:t>
+      </w:r>
+    </w:p>
+    <w:p>
+      <w:pPr>
+        <w:pStyle w:val="ListParagraph"/>
+        <w:numPr>
+          <w:ilvl w:val="0"/>
+          <w:numId w:val="2"/>
+        </w:numPr>
+        <w:spacing w:after="70"/>
+      </w:pPr>
+      <w:r>
+        <w:rPr>
+          <w:sz w:val="21"/>
+          <w:szCs w:val="21"/>
+        </w:rPr>
+        <w:t xml:space="preserve">Verificado que los privilegios revocados de V-03 se mantuvieron.</w:t>
+      </w:r>
+    </w:p>
+    <w:p>
+      <w:pPr>
+        <w:spacing w:after="150"/>
+      </w:pPr>
+      <w:r>
+        <w:rPr>
+          <w:sz w:val="21"/>
+          <w:szCs w:val="21"/>
+        </w:rPr>
+        <w:t xml:space="preserve">Pendiente (fuera del alcance de las herramientas disponibles): alerta de presupuesto en Google Cloud — acción manual de Matías.</w:t>
       </w:r>
     </w:p>
     <w:p>
@@ -2417,7 +2258,630 @@
           <w:sz w:val="23"/>
           <w:szCs w:val="23"/>
         </w:rPr>
-        <w:t xml:space="preserve">V-09 · Casos A–F repetidos 5 veces — No iniciado</w:t>
+        <w:t xml:space="preserve">V-09 · Casos A–F repetidos 5 veces — Corrido, con hallazgo crítico</w:t>
+      </w:r>
+    </w:p>
+    <w:p>
+      <w:pPr>
+        <w:spacing w:after="150"/>
+      </w:pPr>
+      <w:r>
+        <w:rPr>
+          <w:sz w:val="21"/>
+          <w:szCs w:val="21"/>
+        </w:rPr>
+        <w:t xml:space="preserve">Se insertaron 35 citizen_reports reales (7 casos × 5 corridas) y se dejó procesar por el pipeline automático completo.</w:t>
+      </w:r>
+    </w:p>
+    <w:tbl>
+      <w:tblPr>
+        <w:tblW w:type="dxa" w:w="9350"/>
+        <w:tblBorders>
+          <w:top w:val="single" w:color="auto" w:sz="4"/>
+          <w:left w:val="single" w:color="auto" w:sz="4"/>
+          <w:bottom w:val="single" w:color="auto" w:sz="4"/>
+          <w:right w:val="single" w:color="auto" w:sz="4"/>
+          <w:insideH w:val="single" w:color="auto" w:sz="4"/>
+          <w:insideV w:val="single" w:color="auto" w:sz="4"/>
+        </w:tblBorders>
+      </w:tblPr>
+      <w:tblGrid>
+        <w:gridCol w:w="1600"/>
+        <w:gridCol w:w="3200"/>
+        <w:gridCol w:w="4550"/>
+      </w:tblGrid>
+      <w:tr>
+        <w:tc>
+          <w:tcPr>
+            <w:tcW w:type="dxa" w:w="1600"/>
+            <w:shd w:fill="D9E2F3" w:val="clear"/>
+            <w:tcMar>
+              <w:top w:type="dxa" w:w="70"/>
+              <w:left w:type="dxa" w:w="90"/>
+              <w:bottom w:type="dxa" w:w="70"/>
+              <w:right w:type="dxa" w:w="90"/>
+            </w:tcMar>
+          </w:tcPr>
+          <w:p>
+            <w:r>
+              <w:rPr>
+                <w:b/>
+                <w:bCs/>
+                <w:sz w:val="18"/>
+                <w:szCs w:val="18"/>
+              </w:rPr>
+              <w:t xml:space="preserve">Caso</w:t>
+            </w:r>
+          </w:p>
+        </w:tc>
+        <w:tc>
+          <w:tcPr>
+            <w:tcW w:type="dxa" w:w="3200"/>
+            <w:shd w:fill="D9E2F3" w:val="clear"/>
+            <w:tcMar>
+              <w:top w:type="dxa" w:w="70"/>
+              <w:left w:type="dxa" w:w="90"/>
+              <w:bottom w:type="dxa" w:w="70"/>
+              <w:right w:type="dxa" w:w="90"/>
+            </w:tcMar>
+          </w:tcPr>
+          <w:p>
+            <w:r>
+              <w:rPr>
+                <w:b/>
+                <w:bCs/>
+                <w:sz w:val="18"/>
+                <w:szCs w:val="18"/>
+              </w:rPr>
+              <w:t xml:space="preserve">Resultado</w:t>
+            </w:r>
+          </w:p>
+        </w:tc>
+        <w:tc>
+          <w:tcPr>
+            <w:tcW w:type="dxa" w:w="4550"/>
+            <w:shd w:fill="D9E2F3" w:val="clear"/>
+            <w:tcMar>
+              <w:top w:type="dxa" w:w="70"/>
+              <w:left w:type="dxa" w:w="90"/>
+              <w:bottom w:type="dxa" w:w="70"/>
+              <w:right w:type="dxa" w:w="90"/>
+            </w:tcMar>
+          </w:tcPr>
+          <w:p>
+            <w:r>
+              <w:rPr>
+                <w:b/>
+                <w:bCs/>
+                <w:sz w:val="18"/>
+                <w:szCs w:val="18"/>
+              </w:rPr>
+              <w:t xml:space="preserve">Consistencia</w:t>
+            </w:r>
+          </w:p>
+        </w:tc>
+      </w:tr>
+      <w:tr>
+        <w:tc>
+          <w:tcPr>
+            <w:tcW w:type="dxa" w:w="1600"/>
+            <w:tcMar>
+              <w:top w:type="dxa" w:w="70"/>
+              <w:left w:type="dxa" w:w="90"/>
+              <w:bottom w:type="dxa" w:w="70"/>
+              <w:right w:type="dxa" w:w="90"/>
+            </w:tcMar>
+          </w:tcPr>
+          <w:p>
+            <w:r>
+              <w:rPr>
+                <w:b w:val="false"/>
+                <w:bCs w:val="false"/>
+                <w:sz w:val="18"/>
+                <w:szCs w:val="18"/>
+              </w:rPr>
+              <w:t xml:space="preserve">A</w:t>
+            </w:r>
+          </w:p>
+        </w:tc>
+        <w:tc>
+          <w:tcPr>
+            <w:tcW w:type="dxa" w:w="3200"/>
+            <w:tcMar>
+              <w:top w:type="dxa" w:w="70"/>
+              <w:left w:type="dxa" w:w="90"/>
+              <w:bottom w:type="dxa" w:w="70"/>
+              <w:right w:type="dxa" w:w="90"/>
+            </w:tcMar>
+          </w:tcPr>
+          <w:p>
+            <w:r>
+              <w:rPr>
+                <w:b w:val="false"/>
+                <w:bCs w:val="false"/>
+                <w:sz w:val="18"/>
+                <w:szCs w:val="18"/>
+              </w:rPr>
+              <w:t xml:space="preserve">1/5 fundamentado, 4/5 sin_normativa</w:t>
+            </w:r>
+          </w:p>
+        </w:tc>
+        <w:tc>
+          <w:tcPr>
+            <w:tcW w:type="dxa" w:w="4550"/>
+            <w:tcMar>
+              <w:top w:type="dxa" w:w="70"/>
+              <w:left w:type="dxa" w:w="90"/>
+              <w:bottom w:type="dxa" w:w="70"/>
+              <w:right w:type="dxa" w:w="90"/>
+            </w:tcMar>
+          </w:tcPr>
+          <w:p>
+            <w:r>
+              <w:rPr>
+                <w:b w:val="false"/>
+                <w:bCs w:val="false"/>
+                <w:sz w:val="18"/>
+                <w:szCs w:val="18"/>
+              </w:rPr>
+              <w:t xml:space="preserve">Inconsistente (coincide con V-10)</w:t>
+            </w:r>
+          </w:p>
+        </w:tc>
+      </w:tr>
+      <w:tr>
+        <w:tc>
+          <w:tcPr>
+            <w:tcW w:type="dxa" w:w="1600"/>
+            <w:tcMar>
+              <w:top w:type="dxa" w:w="70"/>
+              <w:left w:type="dxa" w:w="90"/>
+              <w:bottom w:type="dxa" w:w="70"/>
+              <w:right w:type="dxa" w:w="90"/>
+            </w:tcMar>
+          </w:tcPr>
+          <w:p>
+            <w:r>
+              <w:rPr>
+                <w:b w:val="false"/>
+                <w:bCs w:val="false"/>
+                <w:sz w:val="18"/>
+                <w:szCs w:val="18"/>
+              </w:rPr>
+              <w:t xml:space="preserve">B</w:t>
+            </w:r>
+          </w:p>
+        </w:tc>
+        <w:tc>
+          <w:tcPr>
+            <w:tcW w:type="dxa" w:w="3200"/>
+            <w:tcMar>
+              <w:top w:type="dxa" w:w="70"/>
+              <w:left w:type="dxa" w:w="90"/>
+              <w:bottom w:type="dxa" w:w="70"/>
+              <w:right w:type="dxa" w:w="90"/>
+            </w:tcMar>
+          </w:tcPr>
+          <w:p>
+            <w:r>
+              <w:rPr>
+                <w:b w:val="false"/>
+                <w:bCs w:val="false"/>
+                <w:sz w:val="18"/>
+                <w:szCs w:val="18"/>
+              </w:rPr>
+              <w:t xml:space="preserve">5/5 fundamentado (Ley 2148 + 451, CABA)</w:t>
+            </w:r>
+          </w:p>
+        </w:tc>
+        <w:tc>
+          <w:tcPr>
+            <w:tcW w:type="dxa" w:w="4550"/>
+            <w:tcMar>
+              <w:top w:type="dxa" w:w="70"/>
+              <w:left w:type="dxa" w:w="90"/>
+              <w:bottom w:type="dxa" w:w="70"/>
+              <w:right w:type="dxa" w:w="90"/>
+            </w:tcMar>
+          </w:tcPr>
+          <w:p>
+            <w:r>
+              <w:rPr>
+                <w:b w:val="false"/>
+                <w:bCs w:val="false"/>
+                <w:sz w:val="18"/>
+                <w:szCs w:val="18"/>
+              </w:rPr>
+              <w:t xml:space="preserve">Correcto — nunca citó Ley 24.449</w:t>
+            </w:r>
+          </w:p>
+        </w:tc>
+      </w:tr>
+      <w:tr>
+        <w:tc>
+          <w:tcPr>
+            <w:tcW w:type="dxa" w:w="1600"/>
+            <w:tcMar>
+              <w:top w:type="dxa" w:w="70"/>
+              <w:left w:type="dxa" w:w="90"/>
+              <w:bottom w:type="dxa" w:w="70"/>
+              <w:right w:type="dxa" w:w="90"/>
+            </w:tcMar>
+          </w:tcPr>
+          <w:p>
+            <w:r>
+              <w:rPr>
+                <w:b w:val="false"/>
+                <w:bCs w:val="false"/>
+                <w:sz w:val="18"/>
+                <w:szCs w:val="18"/>
+              </w:rPr>
+              <w:t xml:space="preserve">C (control neg.)</w:t>
+            </w:r>
+          </w:p>
+        </w:tc>
+        <w:tc>
+          <w:tcPr>
+            <w:tcW w:type="dxa" w:w="3200"/>
+            <w:tcMar>
+              <w:top w:type="dxa" w:w="70"/>
+              <w:left w:type="dxa" w:w="90"/>
+              <w:bottom w:type="dxa" w:w="70"/>
+              <w:right w:type="dxa" w:w="90"/>
+            </w:tcMar>
+          </w:tcPr>
+          <w:p>
+            <w:r>
+              <w:rPr>
+                <w:b w:val="false"/>
+                <w:bCs w:val="false"/>
+                <w:sz w:val="18"/>
+                <w:szCs w:val="18"/>
+              </w:rPr>
+              <w:t xml:space="preserve">5/5 fundamentado (Ley 24.449)</w:t>
+            </w:r>
+          </w:p>
+        </w:tc>
+        <w:tc>
+          <w:tcPr>
+            <w:tcW w:type="dxa" w:w="4550"/>
+            <w:tcMar>
+              <w:top w:type="dxa" w:w="70"/>
+              <w:left w:type="dxa" w:w="90"/>
+              <w:bottom w:type="dxa" w:w="70"/>
+              <w:right w:type="dxa" w:w="90"/>
+            </w:tcMar>
+          </w:tcPr>
+          <w:p>
+            <w:r>
+              <w:rPr>
+                <w:b w:val="false"/>
+                <w:bCs w:val="false"/>
+                <w:sz w:val="18"/>
+                <w:szCs w:val="18"/>
+              </w:rPr>
+              <w:t xml:space="preserve">Correcto — filtro de jurisdicción funciona</w:t>
+            </w:r>
+          </w:p>
+        </w:tc>
+      </w:tr>
+      <w:tr>
+        <w:tc>
+          <w:tcPr>
+            <w:tcW w:type="dxa" w:w="1600"/>
+            <w:tcMar>
+              <w:top w:type="dxa" w:w="70"/>
+              <w:left w:type="dxa" w:w="90"/>
+              <w:bottom w:type="dxa" w:w="70"/>
+              <w:right w:type="dxa" w:w="90"/>
+            </w:tcMar>
+          </w:tcPr>
+          <w:p>
+            <w:r>
+              <w:rPr>
+                <w:b w:val="false"/>
+                <w:bCs w:val="false"/>
+                <w:sz w:val="18"/>
+                <w:szCs w:val="18"/>
+              </w:rPr>
+              <w:t xml:space="preserve">D-Avellaneda</w:t>
+            </w:r>
+          </w:p>
+        </w:tc>
+        <w:tc>
+          <w:tcPr>
+            <w:tcW w:type="dxa" w:w="3200"/>
+            <w:tcMar>
+              <w:top w:type="dxa" w:w="70"/>
+              <w:left w:type="dxa" w:w="90"/>
+              <w:bottom w:type="dxa" w:w="70"/>
+              <w:right w:type="dxa" w:w="90"/>
+            </w:tcMar>
+          </w:tcPr>
+          <w:p>
+            <w:r>
+              <w:rPr>
+                <w:b w:val="false"/>
+                <w:bCs w:val="false"/>
+                <w:sz w:val="18"/>
+                <w:szCs w:val="18"/>
+              </w:rPr>
+              <w:t xml:space="preserve">2/5 fundamentado, 3/5 asistencia</w:t>
+            </w:r>
+          </w:p>
+        </w:tc>
+        <w:tc>
+          <w:tcPr>
+            <w:tcW w:type="dxa" w:w="4550"/>
+            <w:tcMar>
+              <w:top w:type="dxa" w:w="70"/>
+              <w:left w:type="dxa" w:w="90"/>
+              <w:bottom w:type="dxa" w:w="70"/>
+              <w:right w:type="dxa" w:w="90"/>
+            </w:tcMar>
+          </w:tcPr>
+          <w:p>
+            <w:r>
+              <w:rPr>
+                <w:b w:val="false"/>
+                <w:bCs w:val="false"/>
+                <w:sz w:val="18"/>
+                <w:szCs w:val="18"/>
+              </w:rPr>
+              <w:t xml:space="preserve">Cita consistente, estado inconsistente</w:t>
+            </w:r>
+          </w:p>
+        </w:tc>
+      </w:tr>
+      <w:tr>
+        <w:tc>
+          <w:tcPr>
+            <w:tcW w:type="dxa" w:w="1600"/>
+            <w:tcMar>
+              <w:top w:type="dxa" w:w="70"/>
+              <w:left w:type="dxa" w:w="90"/>
+              <w:bottom w:type="dxa" w:w="70"/>
+              <w:right w:type="dxa" w:w="90"/>
+            </w:tcMar>
+          </w:tcPr>
+          <w:p>
+            <w:r>
+              <w:rPr>
+                <w:b w:val="false"/>
+                <w:bCs w:val="false"/>
+                <w:sz w:val="18"/>
+                <w:szCs w:val="18"/>
+              </w:rPr>
+              <w:t xml:space="preserve">D-CABA</w:t>
+            </w:r>
+          </w:p>
+        </w:tc>
+        <w:tc>
+          <w:tcPr>
+            <w:tcW w:type="dxa" w:w="3200"/>
+            <w:tcMar>
+              <w:top w:type="dxa" w:w="70"/>
+              <w:left w:type="dxa" w:w="90"/>
+              <w:bottom w:type="dxa" w:w="70"/>
+              <w:right w:type="dxa" w:w="90"/>
+            </w:tcMar>
+          </w:tcPr>
+          <w:p>
+            <w:r>
+              <w:rPr>
+                <w:b w:val="false"/>
+                <w:bCs w:val="false"/>
+                <w:sz w:val="18"/>
+                <w:szCs w:val="18"/>
+              </w:rPr>
+              <w:t xml:space="preserve">5/5 asistencia (Ley 210)</w:t>
+            </w:r>
+          </w:p>
+        </w:tc>
+        <w:tc>
+          <w:tcPr>
+            <w:tcW w:type="dxa" w:w="4550"/>
+            <w:tcMar>
+              <w:top w:type="dxa" w:w="70"/>
+              <w:left w:type="dxa" w:w="90"/>
+              <w:bottom w:type="dxa" w:w="70"/>
+              <w:right w:type="dxa" w:w="90"/>
+            </w:tcMar>
+          </w:tcPr>
+          <w:p>
+            <w:r>
+              <w:rPr>
+                <w:b w:val="false"/>
+                <w:bCs w:val="false"/>
+                <w:sz w:val="18"/>
+                <w:szCs w:val="18"/>
+              </w:rPr>
+              <w:t xml:space="preserve">Consistente; posible decisión de producto</w:t>
+            </w:r>
+          </w:p>
+        </w:tc>
+      </w:tr>
+      <w:tr>
+        <w:tc>
+          <w:tcPr>
+            <w:tcW w:type="dxa" w:w="1600"/>
+            <w:tcMar>
+              <w:top w:type="dxa" w:w="70"/>
+              <w:left w:type="dxa" w:w="90"/>
+              <w:bottom w:type="dxa" w:w="70"/>
+              <w:right w:type="dxa" w:w="90"/>
+            </w:tcMar>
+          </w:tcPr>
+          <w:p>
+            <w:r>
+              <w:rPr>
+                <w:b w:val="false"/>
+                <w:bCs w:val="false"/>
+                <w:sz w:val="18"/>
+                <w:szCs w:val="18"/>
+              </w:rPr>
+              <w:t xml:space="preserve">E</w:t>
+            </w:r>
+          </w:p>
+        </w:tc>
+        <w:tc>
+          <w:tcPr>
+            <w:tcW w:type="dxa" w:w="3200"/>
+            <w:tcMar>
+              <w:top w:type="dxa" w:w="70"/>
+              <w:left w:type="dxa" w:w="90"/>
+              <w:bottom w:type="dxa" w:w="70"/>
+              <w:right w:type="dxa" w:w="90"/>
+            </w:tcMar>
+          </w:tcPr>
+          <w:p>
+            <w:r>
+              <w:rPr>
+                <w:b w:val="false"/>
+                <w:bCs w:val="false"/>
+                <w:sz w:val="18"/>
+                <w:szCs w:val="18"/>
+              </w:rPr>
+              <w:t xml:space="preserve">5/5 fundamentado (Ley 24.449)</w:t>
+            </w:r>
+          </w:p>
+        </w:tc>
+        <w:tc>
+          <w:tcPr>
+            <w:tcW w:type="dxa" w:w="4550"/>
+            <w:tcMar>
+              <w:top w:type="dxa" w:w="70"/>
+              <w:left w:type="dxa" w:w="90"/>
+              <w:bottom w:type="dxa" w:w="70"/>
+              <w:right w:type="dxa" w:w="90"/>
+            </w:tcMar>
+          </w:tcPr>
+          <w:p>
+            <w:r>
+              <w:rPr>
+                <w:b w:val="false"/>
+                <w:bCs w:val="false"/>
+                <w:sz w:val="18"/>
+                <w:szCs w:val="18"/>
+              </w:rPr>
+              <w:t xml:space="preserve">Correcto — no confundió con Código de Faltas</w:t>
+            </w:r>
+          </w:p>
+        </w:tc>
+      </w:tr>
+      <w:tr>
+        <w:tc>
+          <w:tcPr>
+            <w:tcW w:type="dxa" w:w="1600"/>
+            <w:shd w:fill="FDECEA" w:val="clear"/>
+            <w:tcMar>
+              <w:top w:type="dxa" w:w="70"/>
+              <w:left w:type="dxa" w:w="90"/>
+              <w:bottom w:type="dxa" w:w="70"/>
+              <w:right w:type="dxa" w:w="90"/>
+            </w:tcMar>
+          </w:tcPr>
+          <w:p>
+            <w:r>
+              <w:rPr>
+                <w:b w:val="false"/>
+                <w:bCs w:val="false"/>
+                <w:sz w:val="18"/>
+                <w:szCs w:val="18"/>
+              </w:rPr>
+              <w:t xml:space="preserve">F</w:t>
+            </w:r>
+          </w:p>
+        </w:tc>
+        <w:tc>
+          <w:tcPr>
+            <w:tcW w:type="dxa" w:w="3200"/>
+            <w:shd w:fill="FDECEA" w:val="clear"/>
+            <w:tcMar>
+              <w:top w:type="dxa" w:w="70"/>
+              <w:left w:type="dxa" w:w="90"/>
+              <w:bottom w:type="dxa" w:w="70"/>
+              <w:right w:type="dxa" w:w="90"/>
+            </w:tcMar>
+          </w:tcPr>
+          <w:p>
+            <w:r>
+              <w:rPr>
+                <w:b w:val="false"/>
+                <w:bCs w:val="false"/>
+                <w:sz w:val="18"/>
+                <w:szCs w:val="18"/>
+              </w:rPr>
+              <w:t xml:space="preserve">5/5 fundamentado (esperado: sin_normativa)</w:t>
+            </w:r>
+          </w:p>
+        </w:tc>
+        <w:tc>
+          <w:tcPr>
+            <w:tcW w:type="dxa" w:w="4550"/>
+            <w:shd w:fill="FDECEA" w:val="clear"/>
+            <w:tcMar>
+              <w:top w:type="dxa" w:w="70"/>
+              <w:left w:type="dxa" w:w="90"/>
+              <w:bottom w:type="dxa" w:w="70"/>
+              <w:right w:type="dxa" w:w="90"/>
+            </w:tcMar>
+          </w:tcPr>
+          <w:p>
+            <w:r>
+              <w:rPr>
+                <w:b w:val="false"/>
+                <w:bCs w:val="false"/>
+                <w:sz w:val="18"/>
+                <w:szCs w:val="18"/>
+              </w:rPr>
+              <w:t xml:space="preserve">Consistente PERO INCORRECTO</w:t>
+            </w:r>
+          </w:p>
+        </w:tc>
+      </w:tr>
+    </w:tbl>
+    <w:p>
+      <w:pPr>
+        <w:spacing w:after="150"/>
+      </w:pPr>
+    </w:p>
+    <w:p>
+      <w:pPr>
+        <w:pBdr>
+          <w:left w:val="single" w:color="B00020" w:sz="28" w:space="10"/>
+        </w:pBdr>
+        <w:shd w:fill="FDECEA" w:val="clear"/>
+        <w:spacing w:after="200"/>
+      </w:pPr>
+      <w:r>
+        <w:rPr>
+          <w:b/>
+          <w:bCs/>
+          <w:color w:val="B00020"/>
+          <w:sz w:val="21"/>
+          <w:szCs w:val="21"/>
+        </w:rPr>
+        <w:t xml:space="preserve">Hallazgo crítico. </w:t>
+      </w:r>
+      <w:r>
+        <w:rPr>
+          <w:sz w:val="21"/>
+          <w:szCs w:val="21"/>
+        </w:rPr>
+        <w:t xml:space="preserve">El Caso F (comercio irregular, sin corpus cargado) falló 5 de 5. El sistema citó literalmente la Ley 24.449 art. 48 inc. t) ("instalarse o realizar venta de productos en zona alguna del camino") para fundamentar un reclamo de venta ambulante sin habilitación. La cita es literal y pasa la validación vigente, pero es una norma de tránsito vehicular aplicada a un caso de habilitación comercial. No es una cita inventada, pero el efecto práctico es el mismo que el documento buscaba evitar.</w:t>
+      </w:r>
+    </w:p>
+    <w:p>
+      <w:pPr>
+        <w:spacing w:after="150"/>
+      </w:pPr>
+      <w:r>
+        <w:rPr>
+          <w:sz w:val="21"/>
+          <w:szCs w:val="21"/>
+        </w:rPr>
+        <w:t xml:space="preserve">V-09 no se da por cerrado. Requiere una decisión de producto: bloquear la categoría COMERCIO_IRREGULAR hasta que haya corpus real, o afinar el prompt/umbral.</w:t>
       </w:r>
     </w:p>
     <w:p>
@@ -2443,7 +2907,7 @@
           <w:sz w:val="21"/>
           <w:szCs w:val="21"/>
         </w:rPr>
-        <w:t xml:space="preserve">Sin cambios de nuestro lado — a definir en REP-3773 según indica el documento original.</w:t>
+        <w:t xml:space="preserve">Sin cambios de nuestro lado. El resultado de V-09 (Caso A inconsistente) agrega evidencia a esta decisión.</w:t>
       </w:r>
     </w:p>
     <w:p>
@@ -2457,7 +2921,43 @@
           <w:sz w:val="23"/>
           <w:szCs w:val="23"/>
         </w:rPr>
-        <w:t xml:space="preserve">V-11 · Modelo de generación y parámetros — No iniciado</w:t>
+        <w:t xml:space="preserve">V-11 · Modelo de generación y parámetros — Parcial</w:t>
+      </w:r>
+    </w:p>
+    <w:p>
+      <w:pPr>
+        <w:spacing w:after="150"/>
+      </w:pPr>
+      <w:r>
+        <w:rPr>
+          <w:sz w:val="21"/>
+          <w:szCs w:val="21"/>
+        </w:rPr>
+        <w:t xml:space="preserve">generation_models activo coincide con el código real (gemini-3.8-flash). Sin temperature explícito, thinkingLevel: low, responseSchema presente.</w:t>
+      </w:r>
+    </w:p>
+    <w:p>
+      <w:pPr>
+        <w:pBdr>
+          <w:left w:val="single" w:color="999999" w:sz="18" w:space="8"/>
+        </w:pBdr>
+        <w:spacing w:after="200"/>
+      </w:pPr>
+      <w:r>
+        <w:rPr>
+          <w:b/>
+          <w:bCs/>
+          <w:sz w:val="21"/>
+          <w:szCs w:val="21"/>
+        </w:rPr>
+        <w:t xml:space="preserve">Hallazgo. </w:t>
+      </w:r>
+      <w:r>
+        <w:rPr>
+          <w:sz w:val="21"/>
+          <w:szCs w:val="21"/>
+        </w:rPr>
+        <w:t xml:space="preserve">prompt_version nunca se popula en el código actual. El criterio de cierre no se cumple del todo: generation_model_code sí se guarda, prompt_version no.</w:t>
       </w:r>
     </w:p>
     <w:p>
@@ -2483,7 +2983,7 @@
           <w:sz w:val="21"/>
           <w:szCs w:val="21"/>
         </w:rPr>
-        <w:t xml:space="preserve">legalRagService.js/geminiClient.js no tienen ningún import real desde páginas o componentes (solo desde tests). Se corrió pnpm run build y se grepeó dist/: cero coincidencias de claves ni código del cliente — eliminados por tree-shaking.</w:t>
+        <w:t xml:space="preserve">legalRagService.js/geminiClient.js sin imports reales desde la app. Build de producción sin coincidencias de claves ni código del cliente.</w:t>
       </w:r>
     </w:p>
     <w:p>
@@ -2509,7 +3009,7 @@
           <w:sz w:val="21"/>
           <w:szCs w:val="21"/>
         </w:rPr>
-        <w:t xml:space="preserve">Queda para Matías comentar en REP-2908 con el resumen de este documento — no se tocó Jira directamente en ningún momento de este trabajo.</w:t>
+        <w:t xml:space="preserve">Queda para Matías comentar en REP-2908.</w:t>
       </w:r>
     </w:p>
     <w:p>
@@ -2626,7 +3126,7 @@
                 <w:sz w:val="18"/>
                 <w:szCs w:val="18"/>
               </w:rPr>
-              <w:t xml:space="preserve">No — confirmado en V-04. Pendiente de decisión conjunta.</w:t>
+              <w:t xml:space="preserve">No — confirmado en V-04.</w:t>
             </w:r>
           </w:p>
         </w:tc>
@@ -2650,7 +3150,7 @@
                 <w:sz w:val="18"/>
                 <w:szCs w:val="18"/>
               </w:rPr>
-              <w:t xml:space="preserve">¿trg_enqueue_rag_analysis se dispara solo al insertar o también al actualizar?</w:t>
+              <w:t xml:space="preserve">¿trg_enqueue_rag_analysis se dispara solo al insertar?</w:t>
             </w:r>
           </w:p>
         </w:tc>
@@ -2672,7 +3172,7 @@
                 <w:sz w:val="18"/>
                 <w:szCs w:val="18"/>
               </w:rPr>
-              <w:t xml:space="preserve">Solo al insertar (after insert on citizen_reports) — confirmado en el código versionado.</w:t>
+              <w:t xml:space="preserve">Sí, solo al insertar — confirmado en el código.</w:t>
             </w:r>
           </w:p>
         </w:tc>
@@ -2696,7 +3196,7 @@
                 <w:sz w:val="18"/>
                 <w:szCs w:val="18"/>
               </w:rPr>
-              <w:t xml:space="preserve">¿La versión de profile_attends_report es la de la PARTE 5B o una propia?</w:t>
+              <w:t xml:space="preserve">¿profile_attends_report es de la PARTE 5B?</w:t>
             </w:r>
           </w:p>
         </w:tc>
@@ -2718,7 +3218,7 @@
                 <w:sz w:val="18"/>
                 <w:szCs w:val="18"/>
               </w:rPr>
-              <w:t xml:space="preserve">Existe y responde a la firma esperada; no se comparó el cuerpo contra la PARTE 5B línea por línea.</w:t>
+              <w:t xml:space="preserve">Existe con la firma esperada; no comparado línea por línea.</w:t>
             </w:r>
           </w:p>
         </w:tc>
@@ -2742,7 +3242,7 @@
                 <w:sz w:val="18"/>
                 <w:szCs w:val="18"/>
               </w:rPr>
-              <w:t xml:space="preserve">¿Las invocaciones manuales con curl guardaron filas en report_ai_analysis?</w:t>
+              <w:t xml:space="preserve">¿curl manual guardó filas en report_ai_analysis?</w:t>
             </w:r>
           </w:p>
         </w:tc>
@@ -2764,7 +3264,7 @@
                 <w:sz w:val="18"/>
                 <w:szCs w:val="18"/>
               </w:rPr>
-              <w:t xml:space="preserve">No verificado en este trabajo — requiere revisión aparte.</w:t>
+              <w:t xml:space="preserve">No verificado — requiere revisión aparte.</w:t>
             </w:r>
           </w:p>
         </w:tc>
@@ -2810,7 +3310,7 @@
                 <w:sz w:val="18"/>
                 <w:szCs w:val="18"/>
               </w:rPr>
-              <w:t xml:space="preserve">No investigado en este trabajo — lo responde Matías directamente.</w:t>
+              <w:t xml:space="preserve">No investigado — lo responde Matías.</w:t>
             </w:r>
           </w:p>
         </w:tc>
@@ -2844,7 +3344,7 @@
           <w:sz w:val="21"/>
           <w:szCs w:val="21"/>
         </w:rPr>
-        <w:t xml:space="preserve">Decidir V-02 (historial de git) y V-04 (recarga de seeds demo) — bloquean el cierre formal de esos puntos.</w:t>
+        <w:t xml:space="preserve">Decidir el tratamiento de COMERCIO_IRREGULAR (V-09) — lo más urgente, afecta la promesa central del producto.</w:t>
       </w:r>
     </w:p>
     <w:p>
@@ -2861,7 +3361,7 @@
           <w:sz w:val="21"/>
           <w:szCs w:val="21"/>
         </w:rPr>
-        <w:t xml:space="preserve">Abrir el Pull Request de V-05 contra staging una vez autorizado.</w:t>
+        <w:t xml:space="preserve">Decidir V-02 (historial de git) y V-04 (recarga de seeds demo).</w:t>
       </w:r>
     </w:p>
     <w:p>
@@ -2878,7 +3378,7 @@
           <w:sz w:val="21"/>
           <w:szCs w:val="21"/>
         </w:rPr>
-        <w:t xml:space="preserve">Encarar V-08 (límite de reintentos/presupuesto) antes del cierre del Sprint 12 — es P1 y todavía no se tocó.</w:t>
+        <w:t xml:space="preserve">Abrir el Pull Request de V-05 contra staging.</w:t>
       </w:r>
     </w:p>
     <w:p>
@@ -2895,12 +3395,318 @@
           <w:sz w:val="21"/>
           <w:szCs w:val="21"/>
         </w:rPr>
-        <w:t xml:space="preserve">V-06, V-09, V-11 y V-13 quedan para una siguiente pasada, con prioridad P2 salvo indicación contraria.</w:t>
-      </w:r>
-    </w:p>
-    <w:p>
-      <w:pPr>
-        <w:spacing w:before="200"/>
+        <w:t xml:space="preserve">Configurar la alerta de presupuesto de Google Cloud (V-08).</w:t>
+      </w:r>
+    </w:p>
+    <w:p>
+      <w:pPr>
+        <w:pStyle w:val="ListParagraph"/>
+        <w:numPr>
+          <w:ilvl w:val="0"/>
+          <w:numId w:val="2"/>
+        </w:numPr>
+        <w:spacing w:after="70"/>
+      </w:pPr>
+      <w:r>
+        <w:rPr>
+          <w:sz w:val="21"/>
+          <w:szCs w:val="21"/>
+        </w:rPr>
+        <w:t xml:space="preserve">Decidir el esquema de prompt_version (V-11).</w:t>
+      </w:r>
+    </w:p>
+    <w:p>
+      <w:pPr>
+        <w:pStyle w:val="ListParagraph"/>
+        <w:numPr>
+          <w:ilvl w:val="0"/>
+          <w:numId w:val="2"/>
+        </w:numPr>
+        <w:spacing w:after="70"/>
+      </w:pPr>
+      <w:r>
+        <w:rPr>
+          <w:sz w:val="21"/>
+          <w:szCs w:val="21"/>
+        </w:rPr>
+        <w:t xml:space="preserve">V-13 queda pendiente del comentario de Matías en Jira.</w:t>
+      </w:r>
+    </w:p>
+    <w:p>
+      <w:pPr>
+        <w:pStyle w:val="Heading1"/>
+        <w:spacing w:after="120" w:before="260"/>
+      </w:pPr>
+      <w:r>
+        <w:t xml:space="preserve">Nota de versión</w:t>
+      </w:r>
+    </w:p>
+    <w:p>
+      <w:pPr>
+        <w:spacing w:after="120" w:before="100"/>
+      </w:pPr>
+      <w:r>
+        <w:rPr>
+          <w:b/>
+          <w:bCs/>
+          <w:sz w:val="21"/>
+          <w:szCs w:val="21"/>
+        </w:rPr>
+        <w:t xml:space="preserve">v1.1 — 15 de septiembre de 2026</w:t>
+      </w:r>
+    </w:p>
+    <w:tbl>
+      <w:tblPr>
+        <w:tblW w:type="dxa" w:w="9350"/>
+        <w:tblBorders>
+          <w:top w:val="single" w:color="auto" w:sz="4"/>
+          <w:left w:val="single" w:color="auto" w:sz="4"/>
+          <w:bottom w:val="single" w:color="auto" w:sz="4"/>
+          <w:right w:val="single" w:color="auto" w:sz="4"/>
+          <w:insideH w:val="single" w:color="auto" w:sz="4"/>
+          <w:insideV w:val="single" w:color="auto" w:sz="4"/>
+        </w:tblBorders>
+      </w:tblPr>
+      <w:tblGrid>
+        <w:gridCol w:w="4200"/>
+        <w:gridCol w:w="5150"/>
+      </w:tblGrid>
+      <w:tr>
+        <w:tc>
+          <w:tcPr>
+            <w:tcW w:type="dxa" w:w="4200"/>
+            <w:shd w:fill="D9E2F3" w:val="clear"/>
+            <w:tcMar>
+              <w:top w:type="dxa" w:w="70"/>
+              <w:left w:type="dxa" w:w="90"/>
+              <w:bottom w:type="dxa" w:w="70"/>
+              <w:right w:type="dxa" w:w="90"/>
+            </w:tcMar>
+          </w:tcPr>
+          <w:p>
+            <w:r>
+              <w:rPr>
+                <w:b/>
+                <w:bCs/>
+                <w:sz w:val="18"/>
+                <w:szCs w:val="18"/>
+              </w:rPr>
+              <w:t xml:space="preserve">Qué cambió</w:t>
+            </w:r>
+          </w:p>
+        </w:tc>
+        <w:tc>
+          <w:tcPr>
+            <w:tcW w:type="dxa" w:w="5150"/>
+            <w:shd w:fill="D9E2F3" w:val="clear"/>
+            <w:tcMar>
+              <w:top w:type="dxa" w:w="70"/>
+              <w:left w:type="dxa" w:w="90"/>
+              <w:bottom w:type="dxa" w:w="70"/>
+              <w:right w:type="dxa" w:w="90"/>
+            </w:tcMar>
+          </w:tcPr>
+          <w:p>
+            <w:r>
+              <w:rPr>
+                <w:b/>
+                <w:bCs/>
+                <w:sz w:val="18"/>
+                <w:szCs w:val="18"/>
+              </w:rPr>
+              <w:t xml:space="preserve">Por qué</w:t>
+            </w:r>
+          </w:p>
+        </w:tc>
+      </w:tr>
+      <w:tr>
+        <w:tc>
+          <w:tcPr>
+            <w:tcW w:type="dxa" w:w="4200"/>
+            <w:tcMar>
+              <w:top w:type="dxa" w:w="70"/>
+              <w:left w:type="dxa" w:w="90"/>
+              <w:bottom w:type="dxa" w:w="70"/>
+              <w:right w:type="dxa" w:w="90"/>
+            </w:tcMar>
+          </w:tcPr>
+          <w:p>
+            <w:r>
+              <w:rPr>
+                <w:b w:val="false"/>
+                <w:bCs w:val="false"/>
+                <w:sz w:val="18"/>
+                <w:szCs w:val="18"/>
+              </w:rPr>
+              <w:t xml:space="preserve">Se cerró V-06 y se corrió V-09</w:t>
+            </w:r>
+          </w:p>
+        </w:tc>
+        <w:tc>
+          <w:tcPr>
+            <w:tcW w:type="dxa" w:w="5150"/>
+            <w:tcMar>
+              <w:top w:type="dxa" w:w="70"/>
+              <w:left w:type="dxa" w:w="90"/>
+              <w:bottom w:type="dxa" w:w="70"/>
+              <w:right w:type="dxa" w:w="90"/>
+            </w:tcMar>
+          </w:tcPr>
+          <w:p>
+            <w:r>
+              <w:rPr>
+                <w:b w:val="false"/>
+                <w:bCs w:val="false"/>
+                <w:sz w:val="18"/>
+                <w:szCs w:val="18"/>
+              </w:rPr>
+              <w:t xml:space="preserve">Verificaciones pendientes de la v1.0, autorizadas por Matías</w:t>
+            </w:r>
+          </w:p>
+        </w:tc>
+      </w:tr>
+      <w:tr>
+        <w:tc>
+          <w:tcPr>
+            <w:tcW w:type="dxa" w:w="4200"/>
+            <w:tcMar>
+              <w:top w:type="dxa" w:w="70"/>
+              <w:left w:type="dxa" w:w="90"/>
+              <w:bottom w:type="dxa" w:w="70"/>
+              <w:right w:type="dxa" w:w="90"/>
+            </w:tcMar>
+          </w:tcPr>
+          <w:p>
+            <w:r>
+              <w:rPr>
+                <w:b w:val="false"/>
+                <w:bCs w:val="false"/>
+                <w:sz w:val="18"/>
+                <w:szCs w:val="18"/>
+              </w:rPr>
+              <w:t xml:space="preserve">Corrección real aplicada en V-08</w:t>
+            </w:r>
+          </w:p>
+        </w:tc>
+        <w:tc>
+          <w:tcPr>
+            <w:tcW w:type="dxa" w:w="5150"/>
+            <w:tcMar>
+              <w:top w:type="dxa" w:w="70"/>
+              <w:left w:type="dxa" w:w="90"/>
+              <w:bottom w:type="dxa" w:w="70"/>
+              <w:right w:type="dxa" w:w="90"/>
+            </w:tcMar>
+          </w:tcPr>
+          <w:p>
+            <w:r>
+              <w:rPr>
+                <w:b w:val="false"/>
+                <w:bCs w:val="false"/>
+                <w:sz w:val="18"/>
+                <w:szCs w:val="18"/>
+              </w:rPr>
+              <w:t xml:space="preserve">Hallazgo confirmado durante la verificación</w:t>
+            </w:r>
+          </w:p>
+        </w:tc>
+      </w:tr>
+      <w:tr>
+        <w:tc>
+          <w:tcPr>
+            <w:tcW w:type="dxa" w:w="4200"/>
+            <w:tcMar>
+              <w:top w:type="dxa" w:w="70"/>
+              <w:left w:type="dxa" w:w="90"/>
+              <w:bottom w:type="dxa" w:w="70"/>
+              <w:right w:type="dxa" w:w="90"/>
+            </w:tcMar>
+          </w:tcPr>
+          <w:p>
+            <w:r>
+              <w:rPr>
+                <w:b w:val="false"/>
+                <w:bCs w:val="false"/>
+                <w:sz w:val="18"/>
+                <w:szCs w:val="18"/>
+              </w:rPr>
+              <w:t xml:space="preserve">Hallazgo crítico del Caso F en V-09</w:t>
+            </w:r>
+          </w:p>
+        </w:tc>
+        <w:tc>
+          <w:tcPr>
+            <w:tcW w:type="dxa" w:w="5150"/>
+            <w:tcMar>
+              <w:top w:type="dxa" w:w="70"/>
+              <w:left w:type="dxa" w:w="90"/>
+              <w:bottom w:type="dxa" w:w="70"/>
+              <w:right w:type="dxa" w:w="90"/>
+            </w:tcMar>
+          </w:tcPr>
+          <w:p>
+            <w:r>
+              <w:rPr>
+                <w:b w:val="false"/>
+                <w:bCs w:val="false"/>
+                <w:sz w:val="18"/>
+                <w:szCs w:val="18"/>
+              </w:rPr>
+              <w:t xml:space="preserve">Resultado de las 35 corridas — afecta la confiabilidad del producto</w:t>
+            </w:r>
+          </w:p>
+        </w:tc>
+      </w:tr>
+      <w:tr>
+        <w:tc>
+          <w:tcPr>
+            <w:tcW w:type="dxa" w:w="4200"/>
+            <w:tcMar>
+              <w:top w:type="dxa" w:w="70"/>
+              <w:left w:type="dxa" w:w="90"/>
+              <w:bottom w:type="dxa" w:w="70"/>
+              <w:right w:type="dxa" w:w="90"/>
+            </w:tcMar>
+          </w:tcPr>
+          <w:p>
+            <w:r>
+              <w:rPr>
+                <w:b w:val="false"/>
+                <w:bCs w:val="false"/>
+                <w:sz w:val="18"/>
+                <w:szCs w:val="18"/>
+              </w:rPr>
+              <w:t xml:space="preserve">V-03 pasa a "cerrado en lo crítico"</w:t>
+            </w:r>
+          </w:p>
+        </w:tc>
+        <w:tc>
+          <w:tcPr>
+            <w:tcW w:type="dxa" w:w="5150"/>
+            <w:tcMar>
+              <w:top w:type="dxa" w:w="70"/>
+              <w:left w:type="dxa" w:w="90"/>
+              <w:bottom w:type="dxa" w:w="70"/>
+              <w:right w:type="dxa" w:w="90"/>
+            </w:tcMar>
+          </w:tcPr>
+          <w:p>
+            <w:r>
+              <w:rPr>
+                <w:b w:val="false"/>
+                <w:bCs w:val="false"/>
+                <w:sz w:val="18"/>
+                <w:szCs w:val="18"/>
+              </w:rPr>
+              <w:t xml:space="preserve">Los hallazgos P1 de seguridad quedaron resueltos</w:t>
+            </w:r>
+          </w:p>
+        </w:tc>
+      </w:tr>
+    </w:tbl>
+    <w:p>
+      <w:pPr>
+        <w:spacing w:before="220"/>
       </w:pPr>
     </w:p>
     <w:p>
@@ -2913,7 +3719,7 @@
         </w:rPr>
         <w:t xml:space="preserve">Documentos relacionados: </w:t>
       </w:r>
-      <w:hyperlink w:history="1" r:id="rIdpb0avhohedzuxz3cvpy0k">
+      <w:hyperlink w:history="1" r:id="rIdjrqyf5gnn4pyyyj_6boiz">
         <w:r>
           <w:rPr>
             <w:rStyle w:val="Hyperlink"/>
@@ -2930,7 +3736,7 @@
         </w:rPr>
         <w:t xml:space="preserve"> · </w:t>
       </w:r>
-      <w:hyperlink w:history="1" r:id="rIdojmj_g1hv22onsfbgsugw">
+      <w:hyperlink w:history="1" r:id="rIdssgcc8vod1-qstmqknb9t">
         <w:r>
           <w:rPr>
             <w:rStyle w:val="Hyperlink"/>
@@ -2947,7 +3753,7 @@
         </w:rPr>
         <w:t xml:space="preserve"> · </w:t>
       </w:r>
-      <w:hyperlink w:history="1" r:id="rId5ooz_vvbbcjpltk065ipj">
+      <w:hyperlink w:history="1" r:id="rIdrktrwisc85m3zs01cndhq">
         <w:r>
           <w:rPr>
             <w:rStyle w:val="Hyperlink"/>
@@ -2955,6 +3761,23 @@
             <w:u w:val="single"/>
           </w:rPr>
           <w:t xml:space="preserve">REP-2909</w:t>
+        </w:r>
+      </w:hyperlink>
+      <w:r>
+        <w:rPr>
+          <w:sz w:val="20"/>
+          <w:szCs w:val="20"/>
+        </w:rPr>
+        <w:t xml:space="preserve"> · </w:t>
+      </w:r>
+      <w:hyperlink w:history="1" r:id="rIdt3gsicmrswex_c_uuaqjv">
+        <w:r>
+          <w:rPr>
+            <w:rStyle w:val="Hyperlink"/>
+            <w:color w:val="1155CC"/>
+            <w:u w:val="single"/>
+          </w:rPr>
+          <w:t xml:space="preserve">REP-3764</w:t>
         </w:r>
       </w:hyperlink>
     </w:p>

</xml_diff>